<commit_message>
fix(oos-262080): update Suite 114 weekly EM ISS 1 CFU and Cuong Du aliquoting role
</commit_message>
<xml_diff>
--- a/scratch/Celsis table OOS-262080.docx
+++ b/scratch/Celsis table OOS-262080.docx
@@ -360,7 +360,7 @@
                 <w:sz w:val="14"/>
                 <w:szCs w:val="14"/>
               </w:rPr>
-              <w:t xml:space="preserve">America Alanis</w:t>
+              <w:t xml:space="preserve">Cuong Du</w:t>
             </w:r>
           </w:p>
         </w:tc>
@@ -464,7 +464,7 @@
                 <w:sz w:val="14"/>
                 <w:szCs w:val="14"/>
               </w:rPr>
-              <w:t xml:space="preserve">Pending (Gram stain ongoing)</w:t>
+              <w:t xml:space="preserve">No growth was obtained</w:t>
             </w:r>
           </w:p>
         </w:tc>
@@ -4736,7 +4736,7 @@
                 <w:sz w:val="14"/>
                 <w:szCs w:val="14"/>
               </w:rPr>
-              <w:t w:space="preserve" xml:space="preserve">03Sep26</w:t>
+              <w:t>04Sep26</w:t>
             </w:r>
           </w:p>
         </w:tc>
@@ -4761,7 +4761,7 @@
                 <w:sz w:val="14"/>
                 <w:szCs w:val="14"/>
               </w:rPr>
-              <w:t xml:space="preserve"> SMO</w:t>
+              <w:t>ISS</w:t>
             </w:r>
           </w:p>
         </w:tc>
@@ -4819,7 +4819,7 @@
                 <w:sz w:val="14"/>
                 <w:szCs w:val="14"/>
               </w:rPr>
-              <w:t w:space="preserve" xml:space="preserve">No growth</w:t>
+              <w:t>1 CFU (ISO 8 114)</w:t>
             </w:r>
           </w:p>
         </w:tc>
@@ -4850,7 +4850,7 @@
                 <w:sz w:val="14"/>
                 <w:szCs w:val="14"/>
               </w:rPr>
-              <w:t w:space="preserve" xml:space="preserve">N/A</w:t>
+              <w:t>ETX-260914-0487</w:t>
             </w:r>
           </w:p>
         </w:tc>
@@ -4882,7 +4882,7 @@
                 <w:sz w:val="14"/>
                 <w:szCs w:val="14"/>
               </w:rPr>
-              <w:t w:space="preserve" xml:space="preserve">N/A</w:t>
+              <w:t>Pending</w:t>
             </w:r>
           </w:p>
         </w:tc>
@@ -5034,7 +5034,7 @@
                 <w:sz w:val="14"/>
                 <w:szCs w:val="14"/>
               </w:rPr>
-              <w:t xml:space="preserve"> 03Sep26</w:t>
+              <w:t>04Sep26</w:t>
             </w:r>
           </w:p>
         </w:tc>
@@ -5059,7 +5059,7 @@
                 <w:sz w:val="14"/>
                 <w:szCs w:val="14"/>
               </w:rPr>
-              <w:t xml:space="preserve"> SMO</w:t>
+              <w:t>ISS</w:t>
             </w:r>
           </w:p>
         </w:tc>
@@ -5117,7 +5117,7 @@
                 <w:sz w:val="14"/>
                 <w:szCs w:val="14"/>
               </w:rPr>
-              <w:t w:space="preserve" xml:space="preserve">No growth</w:t>
+              <w:t>No growth</w:t>
             </w:r>
           </w:p>
         </w:tc>
@@ -5148,7 +5148,7 @@
                 <w:sz w:val="14"/>
                 <w:szCs w:val="14"/>
               </w:rPr>
-              <w:t w:space="preserve" xml:space="preserve">N/A</w:t>
+              <w:t>N/A</w:t>
             </w:r>
           </w:p>
         </w:tc>
@@ -5180,7 +5180,7 @@
                 <w:sz w:val="14"/>
                 <w:szCs w:val="14"/>
               </w:rPr>
-              <w:t w:space="preserve" xml:space="preserve">N/A</w:t>
+              <w:t>N/A</w:t>
             </w:r>
           </w:p>
         </w:tc>
@@ -5809,7 +5809,7 @@
                 <w:sz w:val="14"/>
                 <w:szCs w:val="14"/>
               </w:rPr>
-              <w:t w:space="preserve" xml:space="preserve">07Sep26</w:t>
+              <w:t>03Sep26</w:t>
             </w:r>
           </w:p>
         </w:tc>
@@ -5847,7 +5847,7 @@
                 <w:sz w:val="14"/>
                 <w:szCs w:val="14"/>
               </w:rPr>
-              <w:t w:space="preserve" xml:space="preserve">ALA/CCD</w:t>
+              <w:t>CCD</w:t>
             </w:r>
           </w:p>
         </w:tc>
@@ -6187,16 +6187,15 @@
                 <w:sz w:val="14"/>
                 <w:szCs w:val="14"/>
               </w:rPr>
-              <w:t xml:space="preserve" w:space="preserve"> 08Sep26</w:t>
-            </w:r>
-            <w:r>
-              <w:rPr>
-                <w:rFonts w:ascii="Times New Roman" w:hAnsi="Times New Roman"/>
-                <w:color w:val="000000" w:themeColor="text1"/>
-                <w:sz w:val="14"/>
-                <w:szCs w:val="14"/>
-              </w:rPr>
-              <w:t/>
+              <w:t>08Sep26</w:t>
+            </w:r>
+            <w:r>
+              <w:rPr>
+                <w:rFonts w:ascii="Times New Roman" w:hAnsi="Times New Roman"/>
+                <w:color w:val="000000" w:themeColor="text1"/>
+                <w:sz w:val="14"/>
+                <w:szCs w:val="14"/>
+              </w:rPr>
             </w:r>
           </w:p>
         </w:tc>
@@ -6234,16 +6233,15 @@
                 <w:sz w:val="14"/>
                 <w:szCs w:val="14"/>
               </w:rPr>
-              <w:t w:space="preserve" xml:space="preserve">ALA/CCD </w:t>
-            </w:r>
-            <w:r>
-              <w:rPr>
-                <w:rFonts w:ascii="Times New Roman" w:hAnsi="Times New Roman"/>
-                <w:color w:val="000000" w:themeColor="text1"/>
-                <w:sz w:val="14"/>
-                <w:szCs w:val="14"/>
-              </w:rPr>
-              <w:t xml:space="preserve"/>
+              <w:t>CCD</w:t>
+            </w:r>
+            <w:r>
+              <w:rPr>
+                <w:rFonts w:ascii="Times New Roman" w:hAnsi="Times New Roman"/>
+                <w:color w:val="000000" w:themeColor="text1"/>
+                <w:sz w:val="14"/>
+                <w:szCs w:val="14"/>
+              </w:rPr>
             </w:r>
           </w:p>
         </w:tc>
@@ -6563,16 +6561,15 @@
                 <w:sz w:val="14"/>
                 <w:szCs w:val="14"/>
               </w:rPr>
-              <w:t xml:space="preserve" w:space="preserve"> 09Sep26</w:t>
-            </w:r>
-            <w:r>
-              <w:rPr>
-                <w:rFonts w:ascii="Times New Roman" w:hAnsi="Times New Roman"/>
-                <w:color w:val="000000" w:themeColor="text1"/>
-                <w:sz w:val="14"/>
-                <w:szCs w:val="14"/>
-              </w:rPr>
-              <w:t/>
+              <w:t>15Sep26</w:t>
+            </w:r>
+            <w:r>
+              <w:rPr>
+                <w:rFonts w:ascii="Times New Roman" w:hAnsi="Times New Roman"/>
+                <w:color w:val="000000" w:themeColor="text1"/>
+                <w:sz w:val="14"/>
+                <w:szCs w:val="14"/>
+              </w:rPr>
             </w:r>
           </w:p>
         </w:tc>
@@ -6610,16 +6607,15 @@
                 <w:sz w:val="14"/>
                 <w:szCs w:val="14"/>
               </w:rPr>
-              <w:t w:space="preserve" xml:space="preserve">ALA/CCD </w:t>
-            </w:r>
-            <w:r>
-              <w:rPr>
-                <w:rFonts w:ascii="Times New Roman" w:hAnsi="Times New Roman"/>
-                <w:color w:val="000000" w:themeColor="text1"/>
-                <w:sz w:val="14"/>
-                <w:szCs w:val="14"/>
-              </w:rPr>
-              <w:t xml:space="preserve"/>
+              <w:t>CCD</w:t>
+            </w:r>
+            <w:r>
+              <w:rPr>
+                <w:rFonts w:ascii="Times New Roman" w:hAnsi="Times New Roman"/>
+                <w:color w:val="000000" w:themeColor="text1"/>
+                <w:sz w:val="14"/>
+                <w:szCs w:val="14"/>
+              </w:rPr>
             </w:r>
           </w:p>
         </w:tc>
@@ -6995,16 +6991,15 @@
                 <w:sz w:val="14"/>
                 <w:szCs w:val="14"/>
               </w:rPr>
-              <w:t xml:space="preserve" w:space="preserve"> 07Sep26</w:t>
-            </w:r>
-            <w:r>
-              <w:rPr>
-                <w:rFonts w:ascii="Times New Roman" w:hAnsi="Times New Roman"/>
-                <w:color w:val="000000" w:themeColor="text1"/>
-                <w:sz w:val="14"/>
-                <w:szCs w:val="14"/>
-              </w:rPr>
-              <w:t/>
+              <w:t>07Sep26</w:t>
+            </w:r>
+            <w:r>
+              <w:rPr>
+                <w:rFonts w:ascii="Times New Roman" w:hAnsi="Times New Roman"/>
+                <w:color w:val="000000" w:themeColor="text1"/>
+                <w:sz w:val="14"/>
+                <w:szCs w:val="14"/>
+              </w:rPr>
             </w:r>
           </w:p>
         </w:tc>
@@ -7042,7 +7037,7 @@
                 <w:sz w:val="14"/>
                 <w:szCs w:val="14"/>
               </w:rPr>
-              <w:t w:space="preserve" xml:space="preserve">ALA/CCD</w:t>
+              <w:t>ALA</w:t>
             </w:r>
           </w:p>
         </w:tc>
@@ -7432,16 +7427,15 @@
                 <w:sz w:val="14"/>
                 <w:szCs w:val="14"/>
               </w:rPr>
-              <w:t xml:space="preserve" w:space="preserve"> 08Sep26</w:t>
-            </w:r>
-            <w:r>
-              <w:rPr>
-                <w:rFonts w:ascii="Times New Roman" w:hAnsi="Times New Roman"/>
-                <w:color w:val="000000" w:themeColor="text1"/>
-                <w:sz w:val="14"/>
-                <w:szCs w:val="14"/>
-              </w:rPr>
-              <w:t/>
+              <w:t>08Sep26</w:t>
+            </w:r>
+            <w:r>
+              <w:rPr>
+                <w:rFonts w:ascii="Times New Roman" w:hAnsi="Times New Roman"/>
+                <w:color w:val="000000" w:themeColor="text1"/>
+                <w:sz w:val="14"/>
+                <w:szCs w:val="14"/>
+              </w:rPr>
             </w:r>
           </w:p>
         </w:tc>
@@ -7479,16 +7473,15 @@
                 <w:sz w:val="14"/>
                 <w:szCs w:val="14"/>
               </w:rPr>
-              <w:t w:space="preserve" xml:space="preserve">ALA/CCD </w:t>
-            </w:r>
-            <w:r>
-              <w:rPr>
-                <w:rFonts w:ascii="Times New Roman" w:hAnsi="Times New Roman"/>
-                <w:color w:val="000000" w:themeColor="text1"/>
-                <w:sz w:val="14"/>
-                <w:szCs w:val="14"/>
-              </w:rPr>
-              <w:t xml:space="preserve"/>
+              <w:t>CCD</w:t>
+            </w:r>
+            <w:r>
+              <w:rPr>
+                <w:rFonts w:ascii="Times New Roman" w:hAnsi="Times New Roman"/>
+                <w:color w:val="000000" w:themeColor="text1"/>
+                <w:sz w:val="14"/>
+                <w:szCs w:val="14"/>
+              </w:rPr>
             </w:r>
           </w:p>
         </w:tc>
@@ -7826,16 +7819,15 @@
                 <w:sz w:val="14"/>
                 <w:szCs w:val="14"/>
               </w:rPr>
-              <w:t xml:space="preserve" w:space="preserve"> 09Sep26</w:t>
-            </w:r>
-            <w:r>
-              <w:rPr>
-                <w:rFonts w:ascii="Times New Roman" w:hAnsi="Times New Roman"/>
-                <w:color w:val="000000" w:themeColor="text1"/>
-                <w:sz w:val="14"/>
-                <w:szCs w:val="14"/>
-              </w:rPr>
-              <w:t/>
+              <w:t>09Sep26</w:t>
+            </w:r>
+            <w:r>
+              <w:rPr>
+                <w:rFonts w:ascii="Times New Roman" w:hAnsi="Times New Roman"/>
+                <w:color w:val="000000" w:themeColor="text1"/>
+                <w:sz w:val="14"/>
+                <w:szCs w:val="14"/>
+              </w:rPr>
             </w:r>
           </w:p>
         </w:tc>
@@ -7873,16 +7865,15 @@
                 <w:sz w:val="14"/>
                 <w:szCs w:val="14"/>
               </w:rPr>
-              <w:t w:space="preserve" xml:space="preserve">ALA/CCD </w:t>
-            </w:r>
-            <w:r>
-              <w:rPr>
-                <w:rFonts w:ascii="Times New Roman" w:hAnsi="Times New Roman"/>
-                <w:color w:val="000000" w:themeColor="text1"/>
-                <w:sz w:val="14"/>
-                <w:szCs w:val="14"/>
-              </w:rPr>
-              <w:t xml:space="preserve"/>
+              <w:t>ALA</w:t>
+            </w:r>
+            <w:r>
+              <w:rPr>
+                <w:rFonts w:ascii="Times New Roman" w:hAnsi="Times New Roman"/>
+                <w:color w:val="000000" w:themeColor="text1"/>
+                <w:sz w:val="14"/>
+                <w:szCs w:val="14"/>
+              </w:rPr>
             </w:r>
           </w:p>
         </w:tc>
@@ -8258,7 +8249,7 @@
                 <w:sz w:val="14"/>
                 <w:szCs w:val="14"/>
               </w:rPr>
-              <w:t w:space="preserve" xml:space="preserve">07Sep26</w:t>
+              <w:t>07Sep26</w:t>
             </w:r>
           </w:p>
         </w:tc>
@@ -8296,7 +8287,7 @@
                 <w:sz w:val="14"/>
                 <w:szCs w:val="14"/>
               </w:rPr>
-              <w:t w:space="preserve" xml:space="preserve">ALA/CCD</w:t>
+              <w:t>ALA</w:t>
             </w:r>
           </w:p>
         </w:tc>
@@ -8675,16 +8666,15 @@
                 <w:sz w:val="14"/>
                 <w:szCs w:val="14"/>
               </w:rPr>
-              <w:t xml:space="preserve" w:space="preserve"> 08Sep26</w:t>
-            </w:r>
-            <w:r>
-              <w:rPr>
-                <w:rFonts w:ascii="Times New Roman" w:hAnsi="Times New Roman"/>
-                <w:color w:val="000000" w:themeColor="text1"/>
-                <w:sz w:val="14"/>
-                <w:szCs w:val="14"/>
-              </w:rPr>
-              <w:t/>
+              <w:t>08Sep26</w:t>
+            </w:r>
+            <w:r>
+              <w:rPr>
+                <w:rFonts w:ascii="Times New Roman" w:hAnsi="Times New Roman"/>
+                <w:color w:val="000000" w:themeColor="text1"/>
+                <w:sz w:val="14"/>
+                <w:szCs w:val="14"/>
+              </w:rPr>
             </w:r>
           </w:p>
         </w:tc>
@@ -8722,16 +8712,15 @@
                 <w:sz w:val="14"/>
                 <w:szCs w:val="14"/>
               </w:rPr>
-              <w:t w:space="preserve" xml:space="preserve">ALA/CCD </w:t>
-            </w:r>
-            <w:r>
-              <w:rPr>
-                <w:rFonts w:ascii="Times New Roman" w:hAnsi="Times New Roman"/>
-                <w:color w:val="000000" w:themeColor="text1"/>
-                <w:sz w:val="14"/>
-                <w:szCs w:val="14"/>
-              </w:rPr>
-              <w:t xml:space="preserve"/>
+              <w:t>CCD</w:t>
+            </w:r>
+            <w:r>
+              <w:rPr>
+                <w:rFonts w:ascii="Times New Roman" w:hAnsi="Times New Roman"/>
+                <w:color w:val="000000" w:themeColor="text1"/>
+                <w:sz w:val="14"/>
+                <w:szCs w:val="14"/>
+              </w:rPr>
             </w:r>
           </w:p>
         </w:tc>
@@ -9069,16 +9058,15 @@
                 <w:sz w:val="14"/>
                 <w:szCs w:val="14"/>
               </w:rPr>
-              <w:t xml:space="preserve" w:space="preserve"> 09Sep26</w:t>
-            </w:r>
-            <w:r>
-              <w:rPr>
-                <w:rFonts w:ascii="Times New Roman" w:hAnsi="Times New Roman"/>
-                <w:color w:val="000000" w:themeColor="text1"/>
-                <w:sz w:val="14"/>
-                <w:szCs w:val="14"/>
-              </w:rPr>
-              <w:t/>
+              <w:t>09Sep26</w:t>
+            </w:r>
+            <w:r>
+              <w:rPr>
+                <w:rFonts w:ascii="Times New Roman" w:hAnsi="Times New Roman"/>
+                <w:color w:val="000000" w:themeColor="text1"/>
+                <w:sz w:val="14"/>
+                <w:szCs w:val="14"/>
+              </w:rPr>
             </w:r>
           </w:p>
         </w:tc>
@@ -9116,16 +9104,15 @@
                 <w:sz w:val="14"/>
                 <w:szCs w:val="14"/>
               </w:rPr>
-              <w:t w:space="preserve" xml:space="preserve">ALA/CCD </w:t>
-            </w:r>
-            <w:r>
-              <w:rPr>
-                <w:rFonts w:ascii="Times New Roman" w:hAnsi="Times New Roman"/>
-                <w:color w:val="000000" w:themeColor="text1"/>
-                <w:sz w:val="14"/>
-                <w:szCs w:val="14"/>
-              </w:rPr>
-              <w:t xml:space="preserve"/>
+              <w:t>ALA</w:t>
+            </w:r>
+            <w:r>
+              <w:rPr>
+                <w:rFonts w:ascii="Times New Roman" w:hAnsi="Times New Roman"/>
+                <w:color w:val="000000" w:themeColor="text1"/>
+                <w:sz w:val="14"/>
+                <w:szCs w:val="14"/>
+              </w:rPr>
             </w:r>
           </w:p>
         </w:tc>
@@ -9521,7 +9508,7 @@
                 <w:sz w:val="14"/>
                 <w:szCs w:val="14"/>
               </w:rPr>
-              <w:t w:space="preserve" xml:space="preserve">10Sep26</w:t>
+              <w:t>10Sep26</w:t>
             </w:r>
           </w:p>
         </w:tc>
@@ -9546,7 +9533,7 @@
                 <w:sz w:val="14"/>
                 <w:szCs w:val="14"/>
               </w:rPr>
-              <w:t xml:space="preserve"> SMO</w:t>
+              <w:t>SMO</w:t>
             </w:r>
           </w:p>
         </w:tc>
@@ -9604,7 +9591,7 @@
                 <w:sz w:val="14"/>
                 <w:szCs w:val="14"/>
               </w:rPr>
-              <w:t w:space="preserve" xml:space="preserve">1 CFU (ISO 8 114)</w:t>
+              <w:t>1 CFU (ISO 8 114)</w:t>
             </w:r>
           </w:p>
         </w:tc>
@@ -9635,7 +9622,7 @@
                 <w:sz w:val="14"/>
                 <w:szCs w:val="14"/>
               </w:rPr>
-              <w:t w:space="preserve" xml:space="preserve">ETX-260921-0520</w:t>
+              <w:t>ETX-260921-0520</w:t>
             </w:r>
           </w:p>
         </w:tc>
@@ -9667,7 +9654,7 @@
                 <w:sz w:val="14"/>
                 <w:szCs w:val="14"/>
               </w:rPr>
-              <w:t w:space="preserve" xml:space="preserve">Pending</w:t>
+              <w:t>Pending</w:t>
             </w:r>
           </w:p>
         </w:tc>
@@ -9819,7 +9806,7 @@
                 <w:sz w:val="14"/>
                 <w:szCs w:val="14"/>
               </w:rPr>
-              <w:t xml:space="preserve"> 10Sep26</w:t>
+              <w:t>10Sep26</w:t>
             </w:r>
           </w:p>
         </w:tc>
@@ -9844,7 +9831,7 @@
                 <w:sz w:val="14"/>
                 <w:szCs w:val="14"/>
               </w:rPr>
-              <w:t xml:space="preserve"> SMO</w:t>
+              <w:t>SMO</w:t>
             </w:r>
           </w:p>
         </w:tc>
@@ -9902,7 +9889,7 @@
                 <w:sz w:val="14"/>
                 <w:szCs w:val="14"/>
               </w:rPr>
-              <w:t w:space="preserve" xml:space="preserve">No growth</w:t>
+              <w:t>No growth</w:t>
             </w:r>
           </w:p>
         </w:tc>
@@ -9933,7 +9920,7 @@
                 <w:sz w:val="14"/>
                 <w:szCs w:val="14"/>
               </w:rPr>
-              <w:t w:space="preserve" xml:space="preserve">N/A</w:t>
+              <w:t>N/A</w:t>
             </w:r>
           </w:p>
         </w:tc>
@@ -9965,7 +9952,7 @@
                 <w:sz w:val="14"/>
                 <w:szCs w:val="14"/>
               </w:rPr>
-              <w:t w:space="preserve" xml:space="preserve">N/A</w:t>
+              <w:t>N/A</w:t>
             </w:r>
           </w:p>
         </w:tc>

</xml_diff>

<commit_message>
feat(celsis): integrate live Micrococcus luteus identification for ETX-260921-0520
</commit_message>
<xml_diff>
--- a/scratch/Celsis table OOS-262080.docx
+++ b/scratch/Celsis table OOS-262080.docx
@@ -375,20 +375,23 @@
               <w:jc w:val="center"/>
               <w:rPr>
                 <w:rFonts w:ascii="Times New Roman" w:hAnsi="Times New Roman"/>
-                <w:color w:val="467886"/>
-                <w:sz w:val="14"/>
-                <w:szCs w:val="14"/>
-                <w:u w:val="single"/>
-              </w:rPr>
-            </w:pPr>
-            <w:r>
-              <w:rPr>
-                <w:rFonts w:ascii="Times New Roman" w:hAnsi="Times New Roman"/>
-                <w:sz w:val="14"/>
-                <w:szCs w:val="14"/>
-              </w:rPr>
-              <w:t xml:space="preserve">ETX-260828-0527</w:t>
-            </w:r>
+                <w:sz w:val="14"/>
+                <w:szCs w:val="14"/>
+              </w:rPr>
+            </w:pPr>
+            <w:hyperlink r:id="rId7" w:history="1">
+              <w:r>
+                <w:rPr>
+                  <w:rStyle w:val="Hyperlink"/>
+                  <w:rFonts w:ascii="Times New Roman" w:hAnsi="Times New Roman"/>
+                  <w:color w:val="0000FF"/>
+                  <w:sz w:val="14"/>
+                  <w:szCs w:val="14"/>
+                  <w:u w:val="single"/>
+                </w:rPr>
+                <w:t>ETX-260828-0527</w:t>
+              </w:r>
+            </w:hyperlink>
           </w:p>
         </w:tc>
         <w:tc>
@@ -9608,22 +9611,27 @@
           </w:tcPr>
           <w:p>
             <w:pPr>
-              <w:jc w:val="center"/>
-              <w:rPr>
-                <w:rFonts w:ascii="Times New Roman" w:hAnsi="Times New Roman"/>
-                <w:sz w:val="14"/>
-                <w:szCs w:val="14"/>
-              </w:rPr>
-            </w:pPr>
-            <w:r>
-              <w:rPr>
-                <w:rFonts w:ascii="Times New Roman" w:hAnsi="Times New Roman"/>
-                <w:color w:val="000000" w:themeColor="text1"/>
-                <w:sz w:val="14"/>
-                <w:szCs w:val="14"/>
-              </w:rPr>
-              <w:t>ETX-260921-0520</w:t>
-            </w:r>
+              <w:spacing w:line="360" w:lineRule="auto"/>
+              <w:jc w:val="center"/>
+              <w:rPr>
+                <w:rFonts w:ascii="Times New Roman" w:hAnsi="Times New Roman"/>
+                <w:sz w:val="14"/>
+                <w:szCs w:val="14"/>
+              </w:rPr>
+            </w:pPr>
+            <w:hyperlink r:id="rId8" w:history="1">
+              <w:r>
+                <w:rPr>
+                  <w:rStyle w:val="Hyperlink"/>
+                  <w:rFonts w:ascii="Times New Roman" w:hAnsi="Times New Roman"/>
+                  <w:color w:val="0000FF"/>
+                  <w:sz w:val="14"/>
+                  <w:szCs w:val="14"/>
+                  <w:u w:val="single"/>
+                </w:rPr>
+                <w:t>ETX-260921-0520</w:t>
+              </w:r>
+            </w:hyperlink>
           </w:p>
         </w:tc>
         <w:tc>
@@ -9647,14 +9655,13 @@
                 <w:szCs w:val="14"/>
               </w:rPr>
             </w:pPr>
-            <w:r>
-              <w:rPr>
-                <w:rFonts w:ascii="Times New Roman" w:hAnsi="Times New Roman"/>
-                <w:color w:val="000000" w:themeColor="text1"/>
-                <w:sz w:val="14"/>
-                <w:szCs w:val="14"/>
-              </w:rPr>
-              <w:t>Gram (+) cocci</w:t>
+            <w:r/>
+            <w:r>
+              <w:rPr>
+                <w:rFonts w:ascii="Times New Roman" w:hAnsi="Times New Roman"/>
+                <w:sz w:val="14"/>
+              </w:rPr>
+              <w:t>Micrococcus luteus</w:t>
             </w:r>
           </w:p>
         </w:tc>

</xml_diff>

<commit_message>
feat(celsis): integrate ETX-260914-0487 Corynebacterium and Mycobacterium identification
</commit_message>
<xml_diff>
--- a/scratch/Celsis table OOS-262080.docx
+++ b/scratch/Celsis table OOS-262080.docx
@@ -4839,22 +4839,26 @@
           </w:tcPr>
           <w:p>
             <w:pPr>
-              <w:jc w:val="center"/>
-              <w:rPr>
-                <w:rFonts w:ascii="Times New Roman" w:hAnsi="Times New Roman"/>
-                <w:sz w:val="14"/>
-                <w:szCs w:val="14"/>
-              </w:rPr>
-            </w:pPr>
-            <w:r>
-              <w:rPr>
-                <w:rFonts w:ascii="Times New Roman" w:hAnsi="Times New Roman"/>
-                <w:color w:val="000000" w:themeColor="text1"/>
-                <w:sz w:val="14"/>
-                <w:szCs w:val="14"/>
-              </w:rPr>
-              <w:t>ETX-260914-0487</w:t>
-            </w:r>
+              <w:spacing w:line="360" w:lineRule="auto"/>
+              <w:jc w:val="center"/>
+              <w:rPr>
+                <w:rFonts w:ascii="Times New Roman" w:hAnsi="Times New Roman"/>
+                <w:sz w:val="14"/>
+                <w:szCs w:val="14"/>
+              </w:rPr>
+            </w:pPr>
+            <w:hyperlink r:id="rId9" w:history="1">
+              <w:r>
+                <w:rPr>
+                  <w:rStyle w:val="Hyperlink"/>
+                  <w:rFonts w:ascii="Times New Roman" w:hAnsi="Times New Roman"/>
+                  <w:color w:val="0000FF"/>
+                  <w:sz w:val="14"/>
+                  <w:szCs w:val="14"/>
+                </w:rPr>
+                <w:t>ETX-260914-0487</w:t>
+              </w:r>
+            </w:hyperlink>
           </w:p>
         </w:tc>
         <w:tc>
@@ -4878,14 +4882,15 @@
                 <w:szCs w:val="14"/>
               </w:rPr>
             </w:pPr>
-            <w:r>
-              <w:rPr>
-                <w:rFonts w:ascii="Times New Roman" w:hAnsi="Times New Roman"/>
-                <w:color w:val="000000" w:themeColor="text1"/>
-                <w:sz w:val="14"/>
-                <w:szCs w:val="14"/>
-              </w:rPr>
-              <w:t>Gram (+) coccobacilli &amp; Gram (+) rods</w:t>
+            <w:r/>
+            <w:r>
+              <w:rPr>
+                <w:rFonts w:ascii="Times New Roman" w:hAnsi="Times New Roman"/>
+                <w:sz w:val="13"/>
+              </w:rPr>
+              <w:t>Corynebacterium ureicelerivorans &amp;</w:t>
+              <w:br/>
+              <w:t>Mycobacterium grossiae</w:t>
             </w:r>
           </w:p>
         </w:tc>

</xml_diff>

<commit_message>
fix(tables): eliminate line spacing distortion on hyperlinks and italicize bacterial binomial names with blank line separator
</commit_message>
<xml_diff>
--- a/scratch/Celsis table OOS-262080.docx
+++ b/scratch/Celsis table OOS-262080.docx
@@ -4839,7 +4839,6 @@
           </w:tcPr>
           <w:p>
             <w:pPr>
-              <w:spacing w:line="360" w:lineRule="auto"/>
               <w:jc w:val="center"/>
               <w:rPr>
                 <w:rFonts w:ascii="Times New Roman" w:hAnsi="Times New Roman"/>
@@ -4850,11 +4849,11 @@
             <w:hyperlink r:id="rId9" w:history="1">
               <w:r>
                 <w:rPr>
-                  <w:rStyle w:val="Hyperlink"/>
                   <w:rFonts w:ascii="Times New Roman" w:hAnsi="Times New Roman"/>
                   <w:color w:val="0000FF"/>
                   <w:sz w:val="14"/>
                   <w:szCs w:val="14"/>
+                  <w:u w:val="single"/>
                 </w:rPr>
                 <w:t>ETX-260914-0487</w:t>
               </w:r>
@@ -4878,17 +4877,22 @@
               <w:jc w:val="center"/>
               <w:rPr>
                 <w:rFonts w:ascii="Times New Roman" w:hAnsi="Times New Roman"/>
-                <w:sz w:val="14"/>
-                <w:szCs w:val="14"/>
-              </w:rPr>
-            </w:pPr>
-            <w:r/>
-            <w:r>
-              <w:rPr>
-                <w:rFonts w:ascii="Times New Roman" w:hAnsi="Times New Roman"/>
+                <w:i/>
+                <w:iCs/>
                 <w:sz w:val="13"/>
-              </w:rPr>
-              <w:t>Corynebacterium ureicelerivorans &amp;</w:t>
+                <w:szCs w:val="13"/>
+              </w:rPr>
+            </w:pPr>
+            <w:r>
+              <w:rPr>
+                <w:rFonts w:ascii="Times New Roman" w:hAnsi="Times New Roman"/>
+                <w:i/>
+                <w:iCs/>
+                <w:sz w:val="13"/>
+                <w:szCs w:val="13"/>
+              </w:rPr>
+              <w:t>Corynebacterium ureicelerivorans</w:t>
+              <w:br/>
               <w:br/>
               <w:t>Mycobacterium grossiae</w:t>
             </w:r>
@@ -9616,7 +9620,6 @@
           </w:tcPr>
           <w:p>
             <w:pPr>
-              <w:spacing w:line="360" w:lineRule="auto"/>
               <w:jc w:val="center"/>
               <w:rPr>
                 <w:rFonts w:ascii="Times New Roman" w:hAnsi="Times New Roman"/>
@@ -9627,7 +9630,6 @@
             <w:hyperlink r:id="rId8" w:history="1">
               <w:r>
                 <w:rPr>
-                  <w:rStyle w:val="Hyperlink"/>
                   <w:rFonts w:ascii="Times New Roman" w:hAnsi="Times New Roman"/>
                   <w:color w:val="0000FF"/>
                   <w:sz w:val="14"/>
@@ -9656,15 +9658,19 @@
               <w:jc w:val="center"/>
               <w:rPr>
                 <w:rFonts w:ascii="Times New Roman" w:hAnsi="Times New Roman"/>
-                <w:sz w:val="14"/>
-                <w:szCs w:val="14"/>
-              </w:rPr>
-            </w:pPr>
-            <w:r/>
-            <w:r>
-              <w:rPr>
-                <w:rFonts w:ascii="Times New Roman" w:hAnsi="Times New Roman"/>
-                <w:sz w:val="14"/>
+                <w:i/>
+                <w:iCs/>
+                <w:sz w:val="14"/>
+                <w:szCs w:val="14"/>
+              </w:rPr>
+            </w:pPr>
+            <w:r>
+              <w:rPr>
+                <w:rFonts w:ascii="Times New Roman" w:hAnsi="Times New Roman"/>
+                <w:i/>
+                <w:iCs/>
+                <w:sz w:val="14"/>
+                <w:szCs w:val="14"/>
               </w:rPr>
               <w:t>Micrococcus luteus</w:t>
             </w:r>

</xml_diff>

<commit_message>
fix(tables): update scratch Celsis table 1 to 2 x 300mL FTM
</commit_message>
<xml_diff>
--- a/scratch/Celsis table OOS-262080.docx
+++ b/scratch/Celsis table OOS-262080.docx
@@ -439,9 +439,8 @@
             <w:r>
               <w:rPr>
                 <w:sz w:val="14"/>
-                <w:szCs w:val="14"/>
-              </w:rPr>
-              <w:t xml:space="preserve">1 x 300mL FTM</w:t>
+              </w:rPr>
+              <w:t>2 x 300mL FTM</w:t>
             </w:r>
           </w:p>
         </w:tc>

</xml_diff>